<commit_message>
Reset HR templates to blank forms for public repo
</commit_message>
<xml_diff>
--- a/templates/Employee claim Form -2026.docx
+++ b/templates/Employee claim Form -2026.docx
@@ -263,78 +263,15 @@
             </w:tcBorders>
           </w:tcPr>
           <w:p>
-            <w:pPr>
-              <w:ind w:left="0" w:hanging="2"/>
-              <w:rPr/>
-            </w:pPr>
-            <w:r>
-              <w:rPr>
-                <w:rtl w:val="0"/>
-              </w:rPr>
+            <w:r>
               <w:t xml:space="preserve"> </w:t>
-            </w:r>
-          </w:p>
-          <w:p>
-            <w:pPr>
-              <w:ind w:left="0" w:hanging="2"/>
-              <w:rPr>
-                <w:u w:val="single"/>
-              </w:rPr>
-            </w:pPr>
-            <w:r>
-              <w:rPr>
-                <w:rtl w:val="0"/>
-              </w:rPr>
-              <w:t xml:space="preserve"> Mr./ Ms.  Kavitha Sharma                                                      EMP ID </w:t>
-            </w:r>
-            <w:r>
-              <w:rPr>
-                <w:b w:val="1"/>
-                <w:bCs w:val="1"/>
-                <w:u w:val="single"/>
-                <w:rtl w:val="0"/>
-              </w:rPr>
-              <w:t xml:space="preserve">:- 69</w:t>
-            </w:r>
-            <w:r>
-              <w:rPr>
-                <w:rtl w:val="0"/>
-              </w:rPr>
-            </w:r>
-          </w:p>
-          <w:p>
-            <w:pPr>
-              <w:ind w:left="0" w:hanging="2"/>
-              <w:rPr/>
-            </w:pPr>
-            <w:r>
-              <w:rPr>
-                <w:rtl w:val="0"/>
-              </w:rPr>
-              <w:t xml:space="preserve">Designation :- Software Engineer                                                        Department:-              </w:t>
-            </w:r>
-          </w:p>
-          <w:p>
-            <w:pPr>
-              <w:ind w:left="0" w:hanging="2"/>
-              <w:rPr/>
-            </w:pPr>
-            <w:r>
-              <w:rPr>
-                <w:rtl w:val="0"/>
-              </w:rPr>
-            </w:r>
-          </w:p>
-          <w:p>
-            <w:pPr>
-              <w:ind w:left="0" w:hanging="2"/>
-              <w:rPr/>
-            </w:pPr>
-            <w:r>
-              <w:rPr>
-                <w:rtl w:val="0"/>
-              </w:rPr>
-              <w:t xml:space="preserve">Expenses Period :-     From: 11 NOV ’24 To 17NOV’ 2024         </w:t>
+              <w:br/>
+              <w:t xml:space="preserve"> Mr./ Ms.                                                          EMP ID :- </w:t>
+              <w:br/>
+              <w:t xml:space="preserve">Designation :-                                                         Department:-              </w:t>
+              <w:br/>
+              <w:br/>
+              <w:t xml:space="preserve">Expenses Period :-     From:          To:          </w:t>
             </w:r>
           </w:p>
         </w:tc>
@@ -680,6 +617,12 @@
               <w:tc>
                 <w:tcPr/>
                 <w:p>
+                  <w:r/>
+                </w:p>
+              </w:tc>
+              <w:tc>
+                <w:tcPr/>
+                <w:p>
                   <w:pPr>
                     <w:ind w:left="0" w:hanging="2"/>
                     <w:jc w:val="center"/>
@@ -691,8 +634,23 @@
                       <w:bCs w:val="1"/>
                       <w:rtl w:val="0"/>
                     </w:rPr>
-                    <w:t xml:space="preserve">3 months</w:t>
-                  </w:r>
+                    <w:t xml:space="preserve">Travel/Conveyance</w:t>
+                  </w:r>
+                  <w:r>
+                    <w:rPr>
+                      <w:rtl w:val="0"/>
+                    </w:rPr>
+                  </w:r>
+                </w:p>
+              </w:tc>
+              <w:tc>
+                <w:tcPr/>
+                <w:p>
+                  <w:pPr>
+                    <w:ind w:left="0" w:hanging="2"/>
+                    <w:jc w:val="center"/>
+                    <w:rPr/>
+                  </w:pPr>
                   <w:r>
                     <w:rPr>
                       <w:rtl w:val="0"/>
@@ -714,7 +672,7 @@
                       <w:bCs w:val="1"/>
                       <w:rtl w:val="0"/>
                     </w:rPr>
-                    <w:t xml:space="preserve">Travel/Conveyance</w:t>
+                    <w:t xml:space="preserve">Y</w:t>
                   </w:r>
                   <w:r>
                     <w:rPr>
@@ -726,56 +684,7 @@
               <w:tc>
                 <w:tcPr/>
                 <w:p>
-                  <w:pPr>
-                    <w:ind w:left="0" w:hanging="2"/>
-                    <w:jc w:val="center"/>
-                    <w:rPr/>
-                  </w:pPr>
-                  <w:r>
-                    <w:rPr>
-                      <w:rtl w:val="0"/>
-                    </w:rPr>
-                  </w:r>
-                </w:p>
-              </w:tc>
-              <w:tc>
-                <w:tcPr/>
-                <w:p>
-                  <w:pPr>
-                    <w:ind w:left="0" w:hanging="2"/>
-                    <w:jc w:val="center"/>
-                    <w:rPr/>
-                  </w:pPr>
-                  <w:r>
-                    <w:rPr>
-                      <w:b w:val="1"/>
-                      <w:bCs w:val="1"/>
-                      <w:rtl w:val="0"/>
-                    </w:rPr>
-                    <w:t xml:space="preserve">Y</w:t>
-                  </w:r>
-                  <w:r>
-                    <w:rPr>
-                      <w:rtl w:val="0"/>
-                    </w:rPr>
-                  </w:r>
-                </w:p>
-              </w:tc>
-              <w:tc>
-                <w:tcPr/>
-                <w:p>
-                  <w:pPr>
-                    <w:ind w:left="0" w:hanging="2"/>
-                    <w:jc w:val="right"/>
-                    <w:rPr/>
-                  </w:pPr>
-                  <w:r>
-                    <w:rPr>
-                      <w:rtl w:val="0"/>
-                    </w:rPr>
-                    <w:t xml:space="preserve">12232.47</w:t>
-                    <w:tab/>
-                  </w:r>
+                  <w:r/>
                 </w:p>
               </w:tc>
             </w:tr>
@@ -811,6 +720,12 @@
               <w:tc>
                 <w:tcPr/>
                 <w:p>
+                  <w:r/>
+                </w:p>
+              </w:tc>
+              <w:tc>
+                <w:tcPr/>
+                <w:p>
                   <w:pPr>
                     <w:ind w:left="0" w:hanging="2"/>
                     <w:jc w:val="center"/>
@@ -822,8 +737,23 @@
                       <w:bCs w:val="1"/>
                       <w:rtl w:val="0"/>
                     </w:rPr>
-                    <w:t xml:space="preserve">3 months</w:t>
-                  </w:r>
+                    <w:t xml:space="preserve">Food expenses</w:t>
+                  </w:r>
+                  <w:r>
+                    <w:rPr>
+                      <w:rtl w:val="0"/>
+                    </w:rPr>
+                  </w:r>
+                </w:p>
+              </w:tc>
+              <w:tc>
+                <w:tcPr/>
+                <w:p>
+                  <w:pPr>
+                    <w:ind w:left="0" w:hanging="2"/>
+                    <w:jc w:val="center"/>
+                    <w:rPr/>
+                  </w:pPr>
                   <w:r>
                     <w:rPr>
                       <w:rtl w:val="0"/>
@@ -845,7 +775,7 @@
                       <w:bCs w:val="1"/>
                       <w:rtl w:val="0"/>
                     </w:rPr>
-                    <w:t xml:space="preserve">Food expenses</w:t>
+                    <w:t xml:space="preserve">Y</w:t>
                   </w:r>
                   <w:r>
                     <w:rPr>
@@ -857,56 +787,7 @@
               <w:tc>
                 <w:tcPr/>
                 <w:p>
-                  <w:pPr>
-                    <w:ind w:left="0" w:hanging="2"/>
-                    <w:jc w:val="center"/>
-                    <w:rPr/>
-                  </w:pPr>
-                  <w:r>
-                    <w:rPr>
-                      <w:rtl w:val="0"/>
-                    </w:rPr>
-                  </w:r>
-                </w:p>
-              </w:tc>
-              <w:tc>
-                <w:tcPr/>
-                <w:p>
-                  <w:pPr>
-                    <w:ind w:left="0" w:hanging="2"/>
-                    <w:jc w:val="center"/>
-                    <w:rPr/>
-                  </w:pPr>
-                  <w:r>
-                    <w:rPr>
-                      <w:b w:val="1"/>
-                      <w:bCs w:val="1"/>
-                      <w:rtl w:val="0"/>
-                    </w:rPr>
-                    <w:t xml:space="preserve">Y</w:t>
-                  </w:r>
-                  <w:r>
-                    <w:rPr>
-                      <w:rtl w:val="0"/>
-                    </w:rPr>
-                  </w:r>
-                </w:p>
-              </w:tc>
-              <w:tc>
-                <w:tcPr/>
-                <w:p>
-                  <w:pPr>
-                    <w:ind w:left="0" w:hanging="2"/>
-                    <w:jc w:val="right"/>
-                    <w:rPr/>
-                  </w:pPr>
-                  <w:r>
-                    <w:rPr>
-                      <w:rtl w:val="0"/>
-                    </w:rPr>
-                    <w:t xml:space="preserve">12291.62</w:t>
-                    <w:tab/>
-                  </w:r>
+                  <w:r/>
                 </w:p>
               </w:tc>
             </w:tr>
@@ -942,8 +823,14 @@
               <w:tc>
                 <w:tcPr/>
                 <w:p>
-                  <w:pPr>
-                    <w:ind w:left="0" w:hanging="2"/>
+                  <w:r/>
+                </w:p>
+              </w:tc>
+              <w:tc>
+                <w:tcPr/>
+                <w:p>
+                  <w:pPr>
+                    <w:ind w:left="0" w:firstLine="0"/>
                     <w:jc w:val="center"/>
                     <w:rPr/>
                   </w:pPr>
@@ -953,7 +840,7 @@
                       <w:bCs w:val="1"/>
                       <w:rtl w:val="0"/>
                     </w:rPr>
-                    <w:t xml:space="preserve">3 months</w:t>
+                    <w:t xml:space="preserve">Driver recipt</w:t>
                   </w:r>
                   <w:r>
                     <w:rPr>
@@ -966,7 +853,22 @@
                 <w:tcPr/>
                 <w:p>
                   <w:pPr>
-                    <w:ind w:left="0" w:firstLine="0"/>
+                    <w:ind w:left="0" w:hanging="2"/>
+                    <w:jc w:val="center"/>
+                    <w:rPr/>
+                  </w:pPr>
+                  <w:r>
+                    <w:rPr>
+                      <w:rtl w:val="0"/>
+                    </w:rPr>
+                  </w:r>
+                </w:p>
+              </w:tc>
+              <w:tc>
+                <w:tcPr/>
+                <w:p>
+                  <w:pPr>
+                    <w:ind w:left="0" w:hanging="2"/>
                     <w:jc w:val="center"/>
                     <w:rPr/>
                   </w:pPr>
@@ -976,7 +878,7 @@
                       <w:bCs w:val="1"/>
                       <w:rtl w:val="0"/>
                     </w:rPr>
-                    <w:t xml:space="preserve">Driver recipt</w:t>
+                    <w:t xml:space="preserve">Y</w:t>
                   </w:r>
                   <w:r>
                     <w:rPr>
@@ -988,62 +890,7 @@
               <w:tc>
                 <w:tcPr/>
                 <w:p>
-                  <w:pPr>
-                    <w:ind w:left="0" w:hanging="2"/>
-                    <w:jc w:val="center"/>
-                    <w:rPr/>
-                  </w:pPr>
-                  <w:r>
-                    <w:rPr>
-                      <w:rtl w:val="0"/>
-                    </w:rPr>
-                  </w:r>
-                </w:p>
-              </w:tc>
-              <w:tc>
-                <w:tcPr/>
-                <w:p>
-                  <w:pPr>
-                    <w:ind w:left="0" w:hanging="2"/>
-                    <w:jc w:val="center"/>
-                    <w:rPr/>
-                  </w:pPr>
-                  <w:r>
-                    <w:rPr>
-                      <w:b w:val="1"/>
-                      <w:bCs w:val="1"/>
-                      <w:rtl w:val="0"/>
-                    </w:rPr>
-                    <w:t xml:space="preserve">Y</w:t>
-                  </w:r>
-                  <w:r>
-                    <w:rPr>
-                      <w:rtl w:val="0"/>
-                    </w:rPr>
-                  </w:r>
-                </w:p>
-              </w:tc>
-              <w:tc>
-                <w:tcPr/>
-                <w:p>
-                  <w:pPr>
-                    <w:ind w:left="0" w:hanging="2"/>
-                    <w:jc w:val="right"/>
-                    <w:rPr/>
-                  </w:pPr>
-                  <w:r>
-                    <w:rPr>
-                      <w:b w:val="1"/>
-                      <w:bCs w:val="1"/>
-                      <w:rtl w:val="0"/>
-                    </w:rPr>
-                    <w:t xml:space="preserve">0</w:t>
-                  </w:r>
-                  <w:r>
-                    <w:rPr>
-                      <w:rtl w:val="0"/>
-                    </w:rPr>
-                  </w:r>
+                  <w:r/>
                 </w:p>
               </w:tc>
             </w:tr>
@@ -1087,24 +934,7 @@
                   </w:tcBorders>
                 </w:tcPr>
                 <w:p>
-                  <w:pPr>
-                    <w:ind w:left="0" w:hanging="2"/>
-                    <w:jc w:val="center"/>
-                    <w:rPr/>
-                  </w:pPr>
-                  <w:r>
-                    <w:rPr>
-                      <w:b w:val="1"/>
-                      <w:bCs w:val="1"/>
-                      <w:rtl w:val="0"/>
-                    </w:rPr>
-                    <w:t xml:space="preserve">3 months</w:t>
-                  </w:r>
-                  <w:r>
-                    <w:rPr>
-                      <w:rtl w:val="0"/>
-                    </w:rPr>
-                  </w:r>
+                  <w:r/>
                 </w:p>
               </w:tc>
               <w:tc>
@@ -1183,24 +1013,7 @@
               <w:tc>
                 <w:tcPr/>
                 <w:p>
-                  <w:pPr>
-                    <w:ind w:left="0" w:hanging="2"/>
-                    <w:jc w:val="right"/>
-                    <w:rPr/>
-                  </w:pPr>
-                  <w:r>
-                    <w:rPr>
-                      <w:b w:val="1"/>
-                      <w:bCs w:val="1"/>
-                      <w:rtl w:val="0"/>
-                    </w:rPr>
-                    <w:t xml:space="preserve">0</w:t>
-                  </w:r>
-                  <w:r>
-                    <w:rPr>
-                      <w:rtl w:val="0"/>
-                    </w:rPr>
-                  </w:r>
+                  <w:r/>
                 </w:p>
               </w:tc>
             </w:tr>
@@ -1336,33 +1149,7 @@
                   </w:tcBorders>
                 </w:tcPr>
                 <w:p>
-                  <w:pPr>
-                    <w:ind w:left="0" w:hanging="2"/>
-                    <w:jc w:val="right"/>
-                    <w:rPr>
-                      <w:rFonts w:ascii="Calibri" w:cs="Calibri" w:eastAsia="Calibri" w:hAnsi="Calibri"/>
-                      <w:color w:val="000000"/>
-                      <w:sz w:val="22"/>
-                      <w:szCs w:val="22"/>
-                    </w:rPr>
-                  </w:pPr>
-                  <w:r>
-                    <w:rPr>
-                      <w:rFonts w:ascii="Calibri" w:cs="Calibri" w:eastAsia="Calibri" w:hAnsi="Calibri"/>
-                      <w:b w:val="1"/>
-                      <w:bCs w:val="1"/>
-                      <w:color w:val="000000"/>
-                      <w:sz w:val="22"/>
-                      <w:szCs w:val="22"/>
-                      <w:rtl w:val="0"/>
-                    </w:rPr>
-                    <w:t xml:space="preserve">24524.09</w:t>
-                  </w:r>
-                  <w:r>
-                    <w:rPr>
-                      <w:rtl w:val="0"/>
-                    </w:rPr>
-                  </w:r>
+                  <w:r/>
                 </w:p>
               </w:tc>
             </w:tr>
@@ -1392,7 +1179,7 @@
                 <w:color w:val="000000"/>
                 <w:rtl w:val="0"/>
               </w:rPr>
-              <w:t xml:space="preserve">Rupees in words: </w:t>
+              <w:t>Rupees in words:</w:t>
             </w:r>
             <w:r>
               <w:rPr>
@@ -1401,7 +1188,6 @@
                 <w:color w:val="000000"/>
                 <w:rtl w:val="0"/>
               </w:rPr>
-              <w:t xml:space="preserve">only</w:t>
             </w:r>
             <w:r>
               <w:rPr>
@@ -1573,7 +1359,7 @@
               <w:rPr>
                 <w:rtl w:val="0"/>
               </w:rPr>
-              <w:t xml:space="preserve">Claimants Signature : Saswat Suman Mishra</w:t>
+              <w:t>Claimants Signature :</w:t>
             </w:r>
           </w:p>
           <w:p>
@@ -1596,7 +1382,7 @@
               <w:rPr>
                 <w:rtl w:val="0"/>
               </w:rPr>
-              <w:t xml:space="preserve">Date : 22/06/2024 </w:t>
+              <w:t xml:space="preserve">Date : </w:t>
             </w:r>
           </w:p>
           <w:p>

</xml_diff>